<commit_message>
Updated script and story flow
</commit_message>
<xml_diff>
--- a/Hobby/Gintama Kai/Documents/Gintama Kai (tentative title)/Gintama Kai (tentative title) Script.docx
+++ b/Hobby/Gintama Kai/Documents/Gintama Kai (tentative title)/Gintama Kai (tentative title) Script.docx
@@ -53,19 +53,7 @@
         <w:rPr>
           <w:lang w:val="en-US"/>
         </w:rPr>
-        <w:t xml:space="preserve">Revision Arc I - </w:t>
-      </w:r>
-      <w:r>
-        <w:rPr>
-          <w:lang w:val="en-US"/>
-        </w:rPr>
-        <w:t>Act 1</w:t>
-      </w:r>
-      <w:r>
-        <w:rPr>
-          <w:lang w:val="en-US"/>
-        </w:rPr>
-        <w:t>: Silver;Gate</w:t>
+        <w:t>Revision Arc I - Act 1: Silver;Gate</w:t>
       </w:r>
     </w:p>
     <w:p>
@@ -618,35 +606,203 @@
         <w:rPr>
           <w:lang w:val="en-US"/>
         </w:rPr>
-      </w:r>
-    </w:p>
-    <w:p>
-      <w:pPr>
-        <w:pStyle w:val="Normal"/>
-        <w:jc w:val="center"/>
-        <w:rPr>
-          <w:lang w:val="en-US"/>
-        </w:rPr>
-      </w:pPr>
-      <w:r>
-        <w:rPr/>
-        <w:t xml:space="preserve">Revision Arc I - </w:t>
-      </w:r>
-      <w:r>
-        <w:rPr/>
-        <w:t>Act 2</w:t>
-      </w:r>
-    </w:p>
-    <w:p>
-      <w:pPr>
-        <w:pStyle w:val="Normal"/>
-        <w:jc w:val="center"/>
-        <w:rPr>
-          <w:lang w:val="en-US"/>
-        </w:rPr>
-      </w:pPr>
-      <w:r>
-        <w:rPr/>
+        <w:t xml:space="preserve">Revision Arc I - Act 2 </w:t>
+      </w:r>
+    </w:p>
+    <w:p>
+      <w:pPr>
+        <w:pStyle w:val="Normal"/>
+        <w:jc w:val="center"/>
+        <w:rPr>
+          <w:lang w:val="en-US"/>
+        </w:rPr>
+      </w:pPr>
+      <w:r>
+        <w:rPr>
+          <w:lang w:val="en-US"/>
+        </w:rPr>
+      </w:r>
+    </w:p>
+    <w:p>
+      <w:pPr>
+        <w:pStyle w:val="Normal"/>
+        <w:jc w:val="center"/>
+        <w:rPr>
+          <w:lang w:val="en-US"/>
+        </w:rPr>
+      </w:pPr>
+      <w:r>
+        <w:rPr>
+          <w:lang w:val="en-US"/>
+        </w:rPr>
+        <w:t>Hasegawa Taizo: “Someone said…”</w:t>
+      </w:r>
+    </w:p>
+    <w:p>
+      <w:pPr>
+        <w:pStyle w:val="Normal"/>
+        <w:jc w:val="center"/>
+        <w:rPr>
+          <w:lang w:val="en-US"/>
+        </w:rPr>
+      </w:pPr>
+      <w:r>
+        <w:rPr>
+          <w:lang w:val="en-US"/>
+        </w:rPr>
+        <w:t>“</w:t>
+      </w:r>
+      <w:r>
+        <w:rPr>
+          <w:lang w:val="en-US"/>
+        </w:rPr>
+        <w:t>...that even if your life is worthless, it will eventually bring good luck.”</w:t>
+      </w:r>
+    </w:p>
+    <w:p>
+      <w:pPr>
+        <w:pStyle w:val="Normal"/>
+        <w:jc w:val="center"/>
+        <w:rPr>
+          <w:lang w:val="en-US"/>
+        </w:rPr>
+      </w:pPr>
+      <w:r>
+        <w:rPr>
+          <w:lang w:val="en-US"/>
+        </w:rPr>
+        <w:t>“</w:t>
+      </w:r>
+      <w:r>
+        <w:rPr>
+          <w:lang w:val="en-US"/>
+        </w:rPr>
+        <w:t>But that is just a lie.”</w:t>
+      </w:r>
+    </w:p>
+    <w:p>
+      <w:pPr>
+        <w:pStyle w:val="Normal"/>
+        <w:jc w:val="center"/>
+        <w:rPr>
+          <w:lang w:val="en-US"/>
+        </w:rPr>
+      </w:pPr>
+      <w:r>
+        <w:rPr>
+          <w:lang w:val="en-US"/>
+        </w:rPr>
+        <w:t>“</w:t>
+      </w:r>
+      <w:r>
+        <w:rPr>
+          <w:lang w:val="en-US"/>
+        </w:rPr>
+        <w:t>I am a totally useless old man, and I have never heard of a god who would bestow charity on someone like me.”</w:t>
+      </w:r>
+    </w:p>
+    <w:p>
+      <w:pPr>
+        <w:pStyle w:val="Normal"/>
+        <w:jc w:val="center"/>
+        <w:rPr>
+          <w:lang w:val="en-US"/>
+        </w:rPr>
+      </w:pPr>
+      <w:r>
+        <w:rPr>
+          <w:lang w:val="en-US"/>
+        </w:rPr>
+        <w:t>“</w:t>
+      </w:r>
+      <w:r>
+        <w:rPr>
+          <w:lang w:val="en-US"/>
+        </w:rPr>
+        <w:t>Until today, that is.”</w:t>
+      </w:r>
+    </w:p>
+    <w:p>
+      <w:pPr>
+        <w:pStyle w:val="Normal"/>
+        <w:jc w:val="center"/>
+        <w:rPr>
+          <w:lang w:val="en-US"/>
+        </w:rPr>
+      </w:pPr>
+      <w:r>
+        <w:rPr>
+          <w:lang w:val="en-US"/>
+        </w:rPr>
+        <w:t>“</w:t>
+      </w:r>
+      <w:r>
+        <w:rPr>
+          <w:lang w:val="en-US"/>
+        </w:rPr>
+        <w:t>What a shady place, this is.”</w:t>
+      </w:r>
+    </w:p>
+    <w:p>
+      <w:pPr>
+        <w:pStyle w:val="Normal"/>
+        <w:jc w:val="center"/>
+        <w:rPr>
+          <w:lang w:val="en-US"/>
+        </w:rPr>
+      </w:pPr>
+      <w:r>
+        <w:rPr>
+          <w:lang w:val="en-US"/>
+        </w:rPr>
+        <w:t>“</w:t>
+      </w:r>
+      <w:r>
+        <w:rPr>
+          <w:lang w:val="en-US"/>
+        </w:rPr>
+        <w:t xml:space="preserve">Although this place is suspicious…” </w:t>
+      </w:r>
+    </w:p>
+    <w:p>
+      <w:pPr>
+        <w:pStyle w:val="Normal"/>
+        <w:jc w:val="center"/>
+        <w:rPr>
+          <w:lang w:val="en-US"/>
+        </w:rPr>
+      </w:pPr>
+      <w:r>
+        <w:rPr>
+          <w:lang w:val="en-US"/>
+        </w:rPr>
+        <w:t>“</w:t>
+      </w:r>
+      <w:r>
+        <w:rPr>
+          <w:lang w:val="en-US"/>
+        </w:rPr>
+        <w:t>...</w:t>
+      </w:r>
+      <w:r>
+        <w:rPr>
+          <w:lang w:val="en-US"/>
+        </w:rPr>
+        <w:t>there is a goddess...”</w:t>
+      </w:r>
+    </w:p>
+    <w:p>
+      <w:pPr>
+        <w:pStyle w:val="Normal"/>
+        <w:jc w:val="center"/>
+        <w:rPr>
+          <w:lang w:val="en-US"/>
+        </w:rPr>
+      </w:pPr>
+      <w:r>
+        <w:rPr>
+          <w:lang w:val="en-US"/>
+        </w:rPr>
       </w:r>
     </w:p>
     <w:p>
@@ -697,7 +853,9 @@
         </w:rPr>
       </w:pPr>
       <w:r>
-        <w:rPr/>
+        <w:rPr>
+          <w:lang w:val="en-US"/>
+        </w:rPr>
       </w:r>
     </w:p>
     <w:p>
@@ -751,13 +909,7 @@
         <w:rPr>
           <w:lang w:val="en-US"/>
         </w:rPr>
-        <w:t xml:space="preserve">???: </w:t>
-      </w:r>
-      <w:r>
-        <w:rPr>
-          <w:lang w:val="en-US"/>
-        </w:rPr>
-        <w:t>Wake up...</w:t>
+        <w:t>???: Wake up...</w:t>
       </w:r>
     </w:p>
     <w:p>
@@ -982,13 +1134,7 @@
         <w:rPr>
           <w:lang w:val="en-US"/>
         </w:rPr>
-        <w:t xml:space="preserve">???: </w:t>
-      </w:r>
-      <w:r>
-        <w:rPr>
-          <w:lang w:val="en-US"/>
-        </w:rPr>
-        <w:t>U-um…</w:t>
+        <w:t>???: U-um…</w:t>
       </w:r>
     </w:p>
     <w:p>
@@ -1333,7 +1479,34 @@
         <w:rPr>
           <w:lang w:val="en-US"/>
         </w:rPr>
-        <w:t>???: ...your Goddess of Victory.</w:t>
+        <w:t xml:space="preserve">???: ...your Goddess of Victory </w:t>
+      </w:r>
+      <w:r>
+        <w:rPr>
+          <w:lang w:val="en-US"/>
+        </w:rPr>
+        <w:t>[Nika]</w:t>
+      </w:r>
+      <w:r>
+        <w:rPr>
+          <w:lang w:val="en-US"/>
+        </w:rPr>
+        <w:t>.</w:t>
+      </w:r>
+    </w:p>
+    <w:p>
+      <w:pPr>
+        <w:pStyle w:val="Normal"/>
+        <w:jc w:val="center"/>
+        <w:rPr>
+          <w:lang w:val="en-US"/>
+        </w:rPr>
+      </w:pPr>
+      <w:r>
+        <w:rPr>
+          <w:lang w:val="en-US"/>
+        </w:rPr>
+        <w:t>Hasegawa Taizo: “[Nika...it sounds like the name of a goddess indeed.]”</w:t>
       </w:r>
     </w:p>
     <w:p>
@@ -1580,6 +1753,96 @@
         <w:rPr>
           <w:lang w:val="en-US"/>
         </w:rPr>
+        <w:t>Hijikata Toshiro: You too, Hasegawa!</w:t>
+      </w:r>
+    </w:p>
+    <w:p>
+      <w:pPr>
+        <w:pStyle w:val="Normal"/>
+        <w:jc w:val="center"/>
+        <w:rPr>
+          <w:lang w:val="en-US"/>
+        </w:rPr>
+      </w:pPr>
+      <w:r>
+        <w:rPr>
+          <w:lang w:val="en-US"/>
+        </w:rPr>
+        <w:t xml:space="preserve">Hasegawa Taizo: Why me?! </w:t>
+      </w:r>
+    </w:p>
+    <w:p>
+      <w:pPr>
+        <w:pStyle w:val="Normal"/>
+        <w:jc w:val="center"/>
+        <w:rPr>
+          <w:lang w:val="en-US"/>
+        </w:rPr>
+      </w:pPr>
+      <w:r>
+        <w:rPr>
+          <w:lang w:val="en-US"/>
+        </w:rPr>
+        <w:t xml:space="preserve">Hijikata Toshiro: Because you have been [illegelly] trespassing on our territory without a permit. [Also, because you are a bum] </w:t>
+      </w:r>
+    </w:p>
+    <w:p>
+      <w:pPr>
+        <w:pStyle w:val="Normal"/>
+        <w:jc w:val="center"/>
+        <w:rPr>
+          <w:lang w:val="en-US"/>
+        </w:rPr>
+      </w:pPr>
+      <w:r>
+        <w:rPr>
+          <w:lang w:val="en-US"/>
+        </w:rPr>
+        <w:t>Hasegawa Taizo: [It looks like my luck ran out the moment the police laid eyes on me.]</w:t>
+      </w:r>
+    </w:p>
+    <w:p>
+      <w:pPr>
+        <w:pStyle w:val="Normal"/>
+        <w:jc w:val="center"/>
+        <w:rPr>
+          <w:lang w:val="en-US"/>
+        </w:rPr>
+      </w:pPr>
+      <w:r>
+        <w:rPr>
+          <w:lang w:val="en-US"/>
+        </w:rPr>
+        <w:t>Hasegawa Taizo: [How true is it, “There is one law for the rich, and another for the poor”]</w:t>
+      </w:r>
+    </w:p>
+    <w:p>
+      <w:pPr>
+        <w:pStyle w:val="Normal"/>
+        <w:jc w:val="center"/>
+        <w:rPr>
+          <w:lang w:val="en-US"/>
+        </w:rPr>
+      </w:pPr>
+      <w:r>
+        <w:rPr>
+          <w:lang w:val="en-US"/>
+        </w:rPr>
+        <w:t>Hasegawa Taizo: [“The poor guy is a loser dog, after all.”]</w:t>
+      </w:r>
+    </w:p>
+    <w:p>
+      <w:pPr>
+        <w:pStyle w:val="Normal"/>
+        <w:jc w:val="center"/>
+        <w:rPr>
+          <w:lang w:val="en-US"/>
+        </w:rPr>
+      </w:pPr>
+      <w:r>
+        <w:rPr>
+          <w:lang w:val="en-US"/>
+        </w:rPr>
         <w:t>Hijikata Toshiro: Just give up, and tell us the way back to our police station!</w:t>
       </w:r>
     </w:p>
@@ -1640,7 +1903,19 @@
         <w:rPr>
           <w:lang w:val="en-US"/>
         </w:rPr>
-        <w:t xml:space="preserve">Hijikata Toshiro: Not just a goddess, but also death gods (shinigami), lords and even streakers. </w:t>
+        <w:t xml:space="preserve">Hijikata Toshiro: Not just a goddess, but also death gods (shinigami), lords and even </w:t>
+      </w:r>
+      <w:r>
+        <w:rPr>
+          <w:lang w:val="en-US"/>
+        </w:rPr>
+        <w:t>saints</w:t>
+      </w:r>
+      <w:r>
+        <w:rPr>
+          <w:lang w:val="en-US"/>
+        </w:rPr>
+        <w:t xml:space="preserve">. </w:t>
       </w:r>
     </w:p>
     <w:p>
@@ -1745,13 +2020,7 @@
         <w:rPr>
           <w:lang w:val="en-US"/>
         </w:rPr>
-        <w:t xml:space="preserve">Kondo Isao: Yes, </w:t>
-      </w:r>
-      <w:r>
-        <w:rPr>
-          <w:lang w:val="en-US"/>
-        </w:rPr>
-        <w:t>you have had it really tough during your life.</w:t>
+        <w:t>Kondo Isao: Yes, you have had it really tough during your life.</w:t>
       </w:r>
     </w:p>
     <w:p>
@@ -2006,6 +2275,21 @@
         <w:rPr>
           <w:lang w:val="en-US"/>
         </w:rPr>
+        <w:t>Hasegawa Taizo: [“What a wonderful life. /s  Damn it...]</w:t>
+      </w:r>
+    </w:p>
+    <w:p>
+      <w:pPr>
+        <w:pStyle w:val="Normal"/>
+        <w:jc w:val="center"/>
+        <w:rPr>
+          <w:lang w:val="en-US"/>
+        </w:rPr>
+      </w:pPr>
+      <w:r>
+        <w:rPr>
+          <w:lang w:val="en-US"/>
+        </w:rPr>
         <w:t>Kondo Isao: No, it looks like she has had really bad luck with men.</w:t>
       </w:r>
     </w:p>
@@ -2096,69 +2380,2171 @@
         <w:rPr>
           <w:lang w:val="en-US"/>
         </w:rPr>
-        <w:t>Hijikata Toshiro: What should we do, Kondo-san? She is acting like...[a new wife]</w:t>
-      </w:r>
-    </w:p>
-    <w:p>
-      <w:pPr>
-        <w:pStyle w:val="Normal"/>
-        <w:jc w:val="center"/>
-        <w:rPr>
-          <w:lang w:val="en-US"/>
-        </w:rPr>
-      </w:pPr>
-      <w:r>
-        <w:rPr>
-          <w:lang w:val="en-US"/>
-        </w:rPr>
-        <w:t>Okita Sogo: Are you going to play the role of the husband, Chief?</w:t>
-      </w:r>
-    </w:p>
-    <w:p>
-      <w:pPr>
-        <w:pStyle w:val="Normal"/>
-        <w:jc w:val="center"/>
-        <w:rPr>
-          <w:lang w:val="en-US"/>
-        </w:rPr>
-      </w:pPr>
-      <w:r>
-        <w:rPr>
-          <w:lang w:val="en-US"/>
-        </w:rPr>
-        <w:t>Kondo Isao: Do not say such a stupid thing!</w:t>
-        <w:br/>
-        <w:t>Kondo Isao: I have Otae-san, the only woman in my heart.</w:t>
-      </w:r>
-    </w:p>
-    <w:p>
-      <w:pPr>
-        <w:pStyle w:val="Normal"/>
-        <w:jc w:val="center"/>
-        <w:rPr>
-          <w:lang w:val="en-US"/>
-        </w:rPr>
-      </w:pPr>
-      <w:r>
-        <w:rPr>
-          <w:lang w:val="en-US"/>
-        </w:rPr>
-        <w:t>Kondo Isao: There is no way something like that could happen!</w:t>
-      </w:r>
-    </w:p>
-    <w:p>
-      <w:pPr>
-        <w:pStyle w:val="Normal"/>
-        <w:jc w:val="center"/>
-        <w:rPr>
-          <w:lang w:val="en-US"/>
-        </w:rPr>
-      </w:pPr>
-      <w:r>
-        <w:rPr>
-          <w:lang w:val="en-US"/>
-        </w:rPr>
-        <w:t>Okita Sogo: You say that, but you look like you are ready to join in the farce.</w:t>
+        <w:t>Hijikata Toshiro: What should we do, Kondo-san? She is acting like...</w:t>
+      </w:r>
+      <w:r>
+        <w:rPr>
+          <w:lang w:val="en-US"/>
+        </w:rPr>
+        <w:t>a nursing mother…</w:t>
+      </w:r>
+    </w:p>
+    <w:p>
+      <w:pPr>
+        <w:pStyle w:val="Normal"/>
+        <w:jc w:val="center"/>
+        <w:rPr>
+          <w:lang w:val="en-US"/>
+        </w:rPr>
+      </w:pPr>
+      <w:r>
+        <w:rPr>
+          <w:lang w:val="en-US"/>
+        </w:rPr>
+        <w:t>???: Stop!</w:t>
+      </w:r>
+    </w:p>
+    <w:p>
+      <w:pPr>
+        <w:pStyle w:val="Normal"/>
+        <w:jc w:val="center"/>
+        <w:rPr>
+          <w:lang w:val="en-US"/>
+        </w:rPr>
+      </w:pPr>
+      <w:r>
+        <w:rPr>
+          <w:lang w:val="en-US"/>
+        </w:rPr>
+        <w:t>Hijikata Toshiro: Huh…?</w:t>
+      </w:r>
+    </w:p>
+    <w:p>
+      <w:pPr>
+        <w:pStyle w:val="Normal"/>
+        <w:jc w:val="center"/>
+        <w:rPr>
+          <w:lang w:val="en-US"/>
+        </w:rPr>
+      </w:pPr>
+      <w:r>
+        <w:rPr>
+          <w:lang w:val="en-US"/>
+        </w:rPr>
+        <w:t>???: Do not raise your hand to the goddess! I will not forgive you!</w:t>
+      </w:r>
+    </w:p>
+    <w:p>
+      <w:pPr>
+        <w:pStyle w:val="Normal"/>
+        <w:jc w:val="center"/>
+        <w:rPr>
+          <w:lang w:val="en-US"/>
+        </w:rPr>
+      </w:pPr>
+      <w:r>
+        <w:rPr>
+          <w:lang w:val="en-US"/>
+        </w:rPr>
+        <w:t>Nika: Stop! You misunderstand! They did not do anything bad!</w:t>
+      </w:r>
+    </w:p>
+    <w:p>
+      <w:pPr>
+        <w:pStyle w:val="Normal"/>
+        <w:jc w:val="center"/>
+        <w:rPr>
+          <w:lang w:val="en-US"/>
+        </w:rPr>
+      </w:pPr>
+      <w:r>
+        <w:rPr>
+          <w:lang w:val="en-US"/>
+        </w:rPr>
+        <w:t>???: I have always admired you, Nika….</w:t>
+      </w:r>
+    </w:p>
+    <w:p>
+      <w:pPr>
+        <w:pStyle w:val="Normal"/>
+        <w:jc w:val="center"/>
+        <w:rPr>
+          <w:lang w:val="en-US"/>
+        </w:rPr>
+      </w:pPr>
+      <w:r>
+        <w:rPr>
+          <w:lang w:val="en-US"/>
+        </w:rPr>
+        <w:t>???: Your innocent smile…</w:t>
+      </w:r>
+    </w:p>
+    <w:p>
+      <w:pPr>
+        <w:pStyle w:val="Normal"/>
+        <w:jc w:val="center"/>
+        <w:rPr>
+          <w:lang w:val="en-US"/>
+        </w:rPr>
+      </w:pPr>
+      <w:r>
+        <w:rPr>
+          <w:lang w:val="en-US"/>
+        </w:rPr>
+        <w:t>???: ...and that slightly melancholic beauty mark.</w:t>
+      </w:r>
+    </w:p>
+    <w:p>
+      <w:pPr>
+        <w:pStyle w:val="Normal"/>
+        <w:jc w:val="center"/>
+        <w:rPr>
+          <w:lang w:val="en-US"/>
+        </w:rPr>
+      </w:pPr>
+      <w:r>
+        <w:rPr>
+          <w:lang w:val="en-US"/>
+        </w:rPr>
+        <w:t>???: I have always been watching you from the shadows.</w:t>
+      </w:r>
+    </w:p>
+    <w:p>
+      <w:pPr>
+        <w:pStyle w:val="Normal"/>
+        <w:jc w:val="center"/>
+        <w:rPr>
+          <w:lang w:val="en-US"/>
+        </w:rPr>
+      </w:pPr>
+      <w:r>
+        <w:rPr>
+          <w:lang w:val="en-US"/>
+        </w:rPr>
+        <w:t>Kondo Isao: That is stalking!</w:t>
+      </w:r>
+    </w:p>
+    <w:p>
+      <w:pPr>
+        <w:pStyle w:val="Normal"/>
+        <w:jc w:val="center"/>
+        <w:rPr>
+          <w:lang w:val="en-US"/>
+        </w:rPr>
+      </w:pPr>
+      <w:r>
+        <w:rPr>
+          <w:lang w:val="en-US"/>
+        </w:rPr>
+        <w:t>Hijikata Toshiro: You are one to talk…</w:t>
+      </w:r>
+    </w:p>
+    <w:p>
+      <w:pPr>
+        <w:pStyle w:val="Normal"/>
+        <w:jc w:val="center"/>
+        <w:rPr>
+          <w:lang w:val="en-US"/>
+        </w:rPr>
+      </w:pPr>
+      <w:r>
+        <w:rPr>
+          <w:lang w:val="en-US"/>
+        </w:rPr>
+        <w:t>Kondo Isao: Eh?</w:t>
+      </w:r>
+    </w:p>
+    <w:p>
+      <w:pPr>
+        <w:pStyle w:val="Normal"/>
+        <w:jc w:val="center"/>
+        <w:rPr>
+          <w:lang w:val="en-US"/>
+        </w:rPr>
+      </w:pPr>
+      <w:r>
+        <w:rPr>
+          <w:lang w:val="en-US"/>
+        </w:rPr>
+        <w:t>Okita Sogo: What the heck is going on here?</w:t>
+      </w:r>
+    </w:p>
+    <w:p>
+      <w:pPr>
+        <w:pStyle w:val="Normal"/>
+        <w:jc w:val="center"/>
+        <w:rPr>
+          <w:lang w:val="en-US"/>
+        </w:rPr>
+      </w:pPr>
+      <w:r>
+        <w:rPr>
+          <w:lang w:val="en-US"/>
+        </w:rPr>
+        <w:t>Kondo Isao: Let me explain.</w:t>
+      </w:r>
+    </w:p>
+    <w:p>
+      <w:pPr>
+        <w:pStyle w:val="Normal"/>
+        <w:jc w:val="center"/>
+        <w:rPr>
+          <w:lang w:val="en-US"/>
+        </w:rPr>
+      </w:pPr>
+      <w:r>
+        <w:rPr>
+          <w:lang w:val="en-US"/>
+        </w:rPr>
+        <w:t>Kondo Isao: He is the Angel of Death.</w:t>
+      </w:r>
+    </w:p>
+    <w:p>
+      <w:pPr>
+        <w:pStyle w:val="Normal"/>
+        <w:jc w:val="center"/>
+        <w:rPr>
+          <w:lang w:val="en-US"/>
+        </w:rPr>
+      </w:pPr>
+      <w:r>
+        <w:rPr/>
+      </w:r>
+    </w:p>
+    <w:p>
+      <w:pPr>
+        <w:pStyle w:val="Normal"/>
+        <w:jc w:val="center"/>
+        <w:rPr>
+          <w:lang w:val="en-US"/>
+        </w:rPr>
+      </w:pPr>
+      <w:r>
+        <w:rPr>
+          <w:lang w:val="en-US"/>
+        </w:rPr>
+        <w:t>Kondo Isao: Two years ago, his affairs were uncovered, and they broke up.</w:t>
+      </w:r>
+    </w:p>
+    <w:p>
+      <w:pPr>
+        <w:pStyle w:val="Normal"/>
+        <w:jc w:val="center"/>
+        <w:rPr>
+          <w:lang w:val="en-US"/>
+        </w:rPr>
+      </w:pPr>
+      <w:r>
+        <w:rPr>
+          <w:lang w:val="en-US"/>
+        </w:rPr>
+        <w:t>Kondo Isao: But they are growing to like each other again.</w:t>
+      </w:r>
+    </w:p>
+    <w:p>
+      <w:pPr>
+        <w:pStyle w:val="Normal"/>
+        <w:jc w:val="center"/>
+        <w:rPr>
+          <w:lang w:val="en-US"/>
+        </w:rPr>
+      </w:pPr>
+      <w:r>
+        <w:rPr>
+          <w:lang w:val="en-US"/>
+        </w:rPr>
+        <w:t>???: No, I am the Angel of Death.</w:t>
+      </w:r>
+    </w:p>
+    <w:p>
+      <w:pPr>
+        <w:pStyle w:val="Normal"/>
+        <w:jc w:val="center"/>
+        <w:rPr>
+          <w:lang w:val="en-US"/>
+        </w:rPr>
+      </w:pPr>
+      <w:r>
+        <w:rPr>
+          <w:lang w:val="en-US"/>
+        </w:rPr>
+        <w:t>Nika: Ma-Manager?!</w:t>
+      </w:r>
+    </w:p>
+    <w:p>
+      <w:pPr>
+        <w:pStyle w:val="Normal"/>
+        <w:jc w:val="center"/>
+        <w:rPr>
+          <w:lang w:val="en-US"/>
+        </w:rPr>
+      </w:pPr>
+      <w:r>
+        <w:rPr>
+          <w:lang w:val="en-US"/>
+        </w:rPr>
+        <w:t>Okita Sogo: Another strange man has shown up.</w:t>
+      </w:r>
+    </w:p>
+    <w:p>
+      <w:pPr>
+        <w:pStyle w:val="Normal"/>
+        <w:jc w:val="center"/>
+        <w:rPr>
+          <w:lang w:val="en-US"/>
+        </w:rPr>
+      </w:pPr>
+      <w:r>
+        <w:rPr>
+          <w:lang w:val="en-US"/>
+        </w:rPr>
+        <w:t>???: By the way, I am the God of Poverty!</w:t>
+      </w:r>
+    </w:p>
+    <w:p>
+      <w:pPr>
+        <w:pStyle w:val="Normal"/>
+        <w:jc w:val="center"/>
+        <w:rPr>
+          <w:lang w:val="en-US"/>
+        </w:rPr>
+      </w:pPr>
+      <w:r>
+        <w:rPr>
+          <w:lang w:val="en-US"/>
+        </w:rPr>
+        <w:t>???: But it is strange. I did not have any affairs.</w:t>
+      </w:r>
+    </w:p>
+    <w:p>
+      <w:pPr>
+        <w:pStyle w:val="Normal"/>
+        <w:jc w:val="center"/>
+        <w:rPr>
+          <w:lang w:val="en-US"/>
+        </w:rPr>
+      </w:pPr>
+      <w:r>
+        <w:rPr>
+          <w:lang w:val="en-US"/>
+        </w:rPr>
+        <w:t>Kondo Isao: Ah, then it is probably that!</w:t>
+      </w:r>
+    </w:p>
+    <w:p>
+      <w:pPr>
+        <w:pStyle w:val="Normal"/>
+        <w:jc w:val="center"/>
+        <w:rPr>
+          <w:lang w:val="en-US"/>
+        </w:rPr>
+      </w:pPr>
+      <w:r>
+        <w:rPr>
+          <w:lang w:val="en-US"/>
+        </w:rPr>
+        <w:t>Kondo Isao: Two years ago, right after you lived in sin, he started commiting domestic violence.</w:t>
+      </w:r>
+    </w:p>
+    <w:p>
+      <w:pPr>
+        <w:pStyle w:val="Normal"/>
+        <w:jc w:val="center"/>
+        <w:rPr>
+          <w:lang w:val="en-US"/>
+        </w:rPr>
+      </w:pPr>
+      <w:r>
+        <w:rPr>
+          <w:lang w:val="en-US"/>
+        </w:rPr>
+        <w:t>???: No, that was me. [Note: Parody of Ichigo from BLEACH.]</w:t>
+      </w:r>
+    </w:p>
+    <w:p>
+      <w:pPr>
+        <w:pStyle w:val="Normal"/>
+        <w:jc w:val="center"/>
+        <w:rPr>
+          <w:lang w:val="en-US"/>
+        </w:rPr>
+      </w:pPr>
+      <w:r>
+        <w:rPr>
+          <w:lang w:val="en-US"/>
+        </w:rPr>
+        <w:t>Nika: The Soul Reaper! Why have you come here?!</w:t>
+      </w:r>
+    </w:p>
+    <w:p>
+      <w:pPr>
+        <w:pStyle w:val="Normal"/>
+        <w:jc w:val="center"/>
+        <w:rPr>
+          <w:lang w:val="en-US"/>
+        </w:rPr>
+      </w:pPr>
+      <w:r>
+        <w:rPr>
+          <w:lang w:val="en-US"/>
+        </w:rPr>
+        <w:t>Soul Reaper: Not just me…</w:t>
+      </w:r>
+    </w:p>
+    <w:p>
+      <w:pPr>
+        <w:pStyle w:val="Normal"/>
+        <w:jc w:val="center"/>
+        <w:rPr>
+          <w:lang w:val="en-US"/>
+        </w:rPr>
+      </w:pPr>
+      <w:r>
+        <w:rPr>
+          <w:lang w:val="en-US"/>
+        </w:rPr>
+        <w:t>Soul Reaper: Meifushin, Kijin, Hakaijin, and Sake no Kami [Note: Refers to the God of Netherworld, God of Destruction, Sake no kami (God of Wine).]</w:t>
+      </w:r>
+    </w:p>
+    <w:p>
+      <w:pPr>
+        <w:pStyle w:val="Normal"/>
+        <w:jc w:val="center"/>
+        <w:rPr>
+          <w:lang w:val="en-US"/>
+        </w:rPr>
+      </w:pPr>
+      <w:r>
+        <w:rPr>
+          <w:lang w:val="en-US"/>
+        </w:rPr>
+        <w:t>Soul Reaper: I heard you have been dating all of them for the last two years.</w:t>
+      </w:r>
+    </w:p>
+    <w:p>
+      <w:pPr>
+        <w:pStyle w:val="Normal"/>
+        <w:jc w:val="center"/>
+        <w:rPr>
+          <w:lang w:val="en-US"/>
+        </w:rPr>
+      </w:pPr>
+      <w:r>
+        <w:rPr>
+          <w:lang w:val="en-US"/>
+        </w:rPr>
+        <w:t>God of Poverty: What?! There is no way a goddess would do something like that.</w:t>
+      </w:r>
+    </w:p>
+    <w:p>
+      <w:pPr>
+        <w:pStyle w:val="Normal"/>
+        <w:jc w:val="center"/>
+        <w:rPr>
+          <w:lang w:val="en-US"/>
+        </w:rPr>
+      </w:pPr>
+      <w:r>
+        <w:rPr>
+          <w:lang w:val="en-US"/>
+        </w:rPr>
+        <w:t>Manager: I did not hear anything like that!</w:t>
+      </w:r>
+    </w:p>
+    <w:p>
+      <w:pPr>
+        <w:pStyle w:val="Normal"/>
+        <w:jc w:val="center"/>
+        <w:rPr>
+          <w:lang w:val="en-US"/>
+        </w:rPr>
+      </w:pPr>
+      <w:r>
+        <w:rPr>
+          <w:lang w:val="en-US"/>
+        </w:rPr>
+        <w:t>Nika: W-Well…</w:t>
+      </w:r>
+    </w:p>
+    <w:p>
+      <w:pPr>
+        <w:pStyle w:val="Normal"/>
+        <w:jc w:val="center"/>
+        <w:rPr>
+          <w:lang w:val="en-US"/>
+        </w:rPr>
+      </w:pPr>
+      <w:r>
+        <w:rPr>
+          <w:lang w:val="en-US"/>
+        </w:rPr>
+        <w:t>Hijikata Toshiro: There is not a single decent god...</w:t>
+      </w:r>
+    </w:p>
+    <w:p>
+      <w:pPr>
+        <w:pStyle w:val="Normal"/>
+        <w:jc w:val="center"/>
+        <w:rPr>
+          <w:lang w:val="en-US"/>
+        </w:rPr>
+      </w:pPr>
+      <w:r>
+        <w:rPr>
+          <w:lang w:val="en-US"/>
+        </w:rPr>
+        <w:t>Hijikata Toshiro: Anyway, how can she handle herself around all these people and still keep it a secret?</w:t>
+      </w:r>
+    </w:p>
+    <w:p>
+      <w:pPr>
+        <w:pStyle w:val="Normal"/>
+        <w:jc w:val="center"/>
+        <w:rPr>
+          <w:lang w:val="en-US"/>
+        </w:rPr>
+      </w:pPr>
+      <w:r>
+        <w:rPr>
+          <w:lang w:val="en-US"/>
+        </w:rPr>
+        <w:t>Okita Sogo: Because she is a goddess?</w:t>
+      </w:r>
+    </w:p>
+    <w:p>
+      <w:pPr>
+        <w:pStyle w:val="Normal"/>
+        <w:jc w:val="center"/>
+        <w:rPr>
+          <w:lang w:val="en-US"/>
+        </w:rPr>
+      </w:pPr>
+      <w:r>
+        <w:rPr>
+          <w:lang w:val="en-US"/>
+        </w:rPr>
+        <w:t>Okita Sogo: Or, rather, she is a terrible b#tch.</w:t>
+      </w:r>
+    </w:p>
+    <w:p>
+      <w:pPr>
+        <w:pStyle w:val="Normal"/>
+        <w:jc w:val="center"/>
+        <w:rPr>
+          <w:lang w:val="en-US"/>
+        </w:rPr>
+      </w:pPr>
+      <w:r>
+        <w:rPr>
+          <w:lang w:val="en-US"/>
+        </w:rPr>
+        <w:t>Kondo Isao: I told you...she has had many hardships, has she not?</w:t>
+      </w:r>
+    </w:p>
+    <w:p>
+      <w:pPr>
+        <w:pStyle w:val="Normal"/>
+        <w:jc w:val="center"/>
+        <w:rPr>
+          <w:lang w:val="en-US"/>
+        </w:rPr>
+      </w:pPr>
+      <w:r>
+        <w:rPr>
+          <w:lang w:val="en-US"/>
+        </w:rPr>
+        <w:t>[transition scene]</w:t>
+      </w:r>
+    </w:p>
+    <w:p>
+      <w:pPr>
+        <w:pStyle w:val="Normal"/>
+        <w:jc w:val="center"/>
+        <w:rPr>
+          <w:lang w:val="en-US"/>
+        </w:rPr>
+      </w:pPr>
+      <w:r>
+        <w:rPr>
+          <w:lang w:val="en-US"/>
+        </w:rPr>
+        <w:t>Nika: *sobs*</w:t>
+      </w:r>
+    </w:p>
+    <w:p>
+      <w:pPr>
+        <w:pStyle w:val="Normal"/>
+        <w:jc w:val="center"/>
+        <w:rPr>
+          <w:lang w:val="en-US"/>
+        </w:rPr>
+      </w:pPr>
+      <w:r>
+        <w:rPr>
+          <w:lang w:val="en-US"/>
+        </w:rPr>
+        <w:t>Nika: I have lost everything…*sobs*</w:t>
+      </w:r>
+    </w:p>
+    <w:p>
+      <w:pPr>
+        <w:pStyle w:val="Normal"/>
+        <w:jc w:val="center"/>
+        <w:rPr>
+          <w:lang w:val="en-US"/>
+        </w:rPr>
+      </w:pPr>
+      <w:r>
+        <w:rPr>
+          <w:lang w:val="en-US"/>
+        </w:rPr>
+        <w:t>Nika: I know it is all my fault.</w:t>
+      </w:r>
+    </w:p>
+    <w:p>
+      <w:pPr>
+        <w:pStyle w:val="Normal"/>
+        <w:jc w:val="center"/>
+        <w:rPr>
+          <w:lang w:val="en-US"/>
+        </w:rPr>
+      </w:pPr>
+      <w:r>
+        <w:rPr>
+          <w:lang w:val="en-US"/>
+        </w:rPr>
+        <w:t>Nika: But I was lonely…</w:t>
+      </w:r>
+    </w:p>
+    <w:p>
+      <w:pPr>
+        <w:pStyle w:val="Normal"/>
+        <w:jc w:val="center"/>
+        <w:rPr>
+          <w:lang w:val="en-US"/>
+        </w:rPr>
+      </w:pPr>
+      <w:r>
+        <w:rPr>
+          <w:lang w:val="en-US"/>
+        </w:rPr>
+        <w:t>Nika: Because I am a goddess, I can be a little greedy.</w:t>
+      </w:r>
+    </w:p>
+    <w:p>
+      <w:pPr>
+        <w:pStyle w:val="Normal"/>
+        <w:jc w:val="center"/>
+        <w:rPr>
+          <w:lang w:val="en-US"/>
+        </w:rPr>
+      </w:pPr>
+      <w:r>
+        <w:rPr>
+          <w:lang w:val="en-US"/>
+        </w:rPr>
+        <w:t>Okita Sogo: [Sadist Mode ON]</w:t>
+      </w:r>
+    </w:p>
+    <w:p>
+      <w:pPr>
+        <w:pStyle w:val="Normal"/>
+        <w:jc w:val="center"/>
+        <w:rPr>
+          <w:lang w:val="en-US"/>
+        </w:rPr>
+      </w:pPr>
+      <w:r>
+        <w:rPr>
+          <w:lang w:val="en-US"/>
+        </w:rPr>
+        <w:t>Okita Sogo: If you lost it, then just get it back.</w:t>
+      </w:r>
+    </w:p>
+    <w:p>
+      <w:pPr>
+        <w:pStyle w:val="Normal"/>
+        <w:jc w:val="center"/>
+        <w:rPr>
+          <w:lang w:val="en-US"/>
+        </w:rPr>
+      </w:pPr>
+      <w:r>
+        <w:rPr>
+          <w:lang w:val="en-US"/>
+        </w:rPr>
+        <w:t>Okita Sogo: …</w:t>
+      </w:r>
+    </w:p>
+    <w:p>
+      <w:pPr>
+        <w:pStyle w:val="Normal"/>
+        <w:jc w:val="center"/>
+        <w:rPr>
+          <w:lang w:val="en-US"/>
+        </w:rPr>
+      </w:pPr>
+      <w:r>
+        <w:rPr>
+          <w:lang w:val="en-US"/>
+        </w:rPr>
+        <w:t>Nika: …</w:t>
+      </w:r>
+    </w:p>
+    <w:p>
+      <w:pPr>
+        <w:pStyle w:val="Normal"/>
+        <w:jc w:val="center"/>
+        <w:rPr>
+          <w:lang w:val="en-US"/>
+        </w:rPr>
+      </w:pPr>
+      <w:r>
+        <w:rPr>
+          <w:lang w:val="en-US"/>
+        </w:rPr>
+        <w:t>Nika: That is true! Yes!</w:t>
+      </w:r>
+    </w:p>
+    <w:p>
+      <w:pPr>
+        <w:pStyle w:val="Normal"/>
+        <w:jc w:val="center"/>
+        <w:rPr>
+          <w:lang w:val="en-US"/>
+        </w:rPr>
+      </w:pPr>
+      <w:r>
+        <w:rPr>
+          <w:lang w:val="en-US"/>
+        </w:rPr>
+        <w:t>Hijikata Toshiro &amp; Kondo Isao: ?!</w:t>
+      </w:r>
+    </w:p>
+    <w:p>
+      <w:pPr>
+        <w:pStyle w:val="Normal"/>
+        <w:jc w:val="center"/>
+        <w:rPr>
+          <w:lang w:val="en-US"/>
+        </w:rPr>
+      </w:pPr>
+      <w:r>
+        <w:rPr>
+          <w:lang w:val="en-US"/>
+        </w:rPr>
+        <w:t>Nika: I am Nika, the Goddess of Victory!</w:t>
+      </w:r>
+    </w:p>
+    <w:p>
+      <w:pPr>
+        <w:pStyle w:val="Normal"/>
+        <w:jc w:val="center"/>
+        <w:rPr>
+          <w:lang w:val="en-US"/>
+        </w:rPr>
+      </w:pPr>
+      <w:r>
+        <w:rPr>
+          <w:lang w:val="en-US"/>
+        </w:rPr>
+        <w:t>Nika: I will just take back what I lost!</w:t>
+      </w:r>
+    </w:p>
+    <w:p>
+      <w:pPr>
+        <w:pStyle w:val="Normal"/>
+        <w:jc w:val="center"/>
+        <w:rPr>
+          <w:lang w:val="en-US"/>
+        </w:rPr>
+      </w:pPr>
+      <w:r>
+        <w:rPr>
+          <w:lang w:val="en-US"/>
+        </w:rPr>
+        <w:t>Nika: With my own power! I will win over my happiness with my own power!</w:t>
+      </w:r>
+    </w:p>
+    <w:p>
+      <w:pPr>
+        <w:pStyle w:val="Normal"/>
+        <w:jc w:val="center"/>
+        <w:rPr>
+          <w:lang w:val="en-US"/>
+        </w:rPr>
+      </w:pPr>
+      <w:r>
+        <w:rPr>
+          <w:lang w:val="en-US"/>
+        </w:rPr>
+        <w:t>Hijikata Toshiro &amp; Kondo Isao: What?!</w:t>
+      </w:r>
+    </w:p>
+    <w:p>
+      <w:pPr>
+        <w:pStyle w:val="Normal"/>
+        <w:jc w:val="center"/>
+        <w:rPr>
+          <w:lang w:val="en-US"/>
+        </w:rPr>
+      </w:pPr>
+      <w:r>
+        <w:rPr>
+          <w:lang w:val="en-US"/>
+        </w:rPr>
+        <w:t>Nika: Go for it! Oh!</w:t>
+      </w:r>
+    </w:p>
+    <w:p>
+      <w:pPr>
+        <w:pStyle w:val="Normal"/>
+        <w:jc w:val="center"/>
+        <w:rPr>
+          <w:lang w:val="en-US"/>
+        </w:rPr>
+      </w:pPr>
+      <w:r>
+        <w:rPr>
+          <w:lang w:val="en-US"/>
+        </w:rPr>
+        <w:t>Okita Sogo: [*Smirks and grins menacingly*]</w:t>
+      </w:r>
+    </w:p>
+    <w:p>
+      <w:pPr>
+        <w:pStyle w:val="Normal"/>
+        <w:jc w:val="center"/>
+        <w:rPr>
+          <w:lang w:val="en-US"/>
+        </w:rPr>
+      </w:pPr>
+      <w:r>
+        <w:rPr>
+          <w:lang w:val="en-US"/>
+        </w:rPr>
+        <w:t>Nika: Like this...In order to ensure my true love and happiness</w:t>
+      </w:r>
+    </w:p>
+    <w:p>
+      <w:pPr>
+        <w:pStyle w:val="Normal"/>
+        <w:jc w:val="center"/>
+        <w:rPr>
+          <w:lang w:val="en-US"/>
+        </w:rPr>
+      </w:pPr>
+      <w:r>
+        <w:rPr>
+          <w:lang w:val="en-US"/>
+        </w:rPr>
+        <w:t>Nika: I worked my best to fight…</w:t>
+      </w:r>
+    </w:p>
+    <w:p>
+      <w:pPr>
+        <w:pStyle w:val="Normal"/>
+        <w:jc w:val="center"/>
+        <w:rPr>
+          <w:lang w:val="en-US"/>
+        </w:rPr>
+      </w:pPr>
+      <w:r>
+        <w:rPr>
+          <w:lang w:val="en-US"/>
+        </w:rPr>
+        <w:t>Nika: ...and I kept fighting and fightning…</w:t>
+      </w:r>
+    </w:p>
+    <w:p>
+      <w:pPr>
+        <w:pStyle w:val="Normal"/>
+        <w:jc w:val="center"/>
+        <w:rPr>
+          <w:lang w:val="en-US"/>
+        </w:rPr>
+      </w:pPr>
+      <w:r>
+        <w:rPr>
+          <w:lang w:val="en-US"/>
+        </w:rPr>
+        <w:t>Nika: ...and got lots of men.</w:t>
+      </w:r>
+    </w:p>
+    <w:p>
+      <w:pPr>
+        <w:pStyle w:val="Normal"/>
+        <w:jc w:val="center"/>
+        <w:rPr>
+          <w:lang w:val="en-US"/>
+        </w:rPr>
+      </w:pPr>
+      <w:r>
+        <w:rPr>
+          <w:lang w:val="en-US"/>
+        </w:rPr>
+        <w:t>Nika: And I realized that working hard is so beautiful…</w:t>
+      </w:r>
+    </w:p>
+    <w:p>
+      <w:pPr>
+        <w:pStyle w:val="Normal"/>
+        <w:jc w:val="center"/>
+        <w:rPr>
+          <w:lang w:val="en-US"/>
+        </w:rPr>
+      </w:pPr>
+      <w:r>
+        <w:rPr>
+          <w:lang w:val="en-US"/>
+        </w:rPr>
+        <w:t>Nika: ...periode. Huh? Was this a composition?</w:t>
+      </w:r>
+    </w:p>
+    <w:p>
+      <w:pPr>
+        <w:pStyle w:val="Normal"/>
+        <w:jc w:val="center"/>
+        <w:rPr>
+          <w:lang w:val="en-US"/>
+        </w:rPr>
+      </w:pPr>
+      <w:r>
+        <w:rPr>
+          <w:lang w:val="en-US"/>
+        </w:rPr>
+        <w:t>Nika: P.S. I will be as happy as I can…</w:t>
+      </w:r>
+    </w:p>
+    <w:p>
+      <w:pPr>
+        <w:pStyle w:val="Normal"/>
+        <w:jc w:val="center"/>
+        <w:rPr>
+          <w:lang w:val="en-US"/>
+        </w:rPr>
+      </w:pPr>
+      <w:r>
+        <w:rPr>
+          <w:lang w:val="en-US"/>
+        </w:rPr>
+        <w:t>Okita Sogo: [*grins menancingly*]</w:t>
+      </w:r>
+    </w:p>
+    <w:p>
+      <w:pPr>
+        <w:pStyle w:val="Normal"/>
+        <w:jc w:val="center"/>
+        <w:rPr>
+          <w:lang w:val="en-US"/>
+        </w:rPr>
+      </w:pPr>
+      <w:r>
+        <w:rPr>
+          <w:lang w:val="en-US"/>
+        </w:rPr>
+        <w:t>[Screen distorts and shuts down due to Okita Sogo’s sadistic streak]</w:t>
+      </w:r>
+    </w:p>
+    <w:p>
+      <w:pPr>
+        <w:pStyle w:val="Normal"/>
+        <w:jc w:val="center"/>
+        <w:rPr>
+          <w:lang w:val="en-US"/>
+        </w:rPr>
+      </w:pPr>
+      <w:r>
+        <w:rPr/>
+      </w:r>
+    </w:p>
+    <w:p>
+      <w:pPr>
+        <w:pStyle w:val="Normal"/>
+        <w:jc w:val="center"/>
+        <w:rPr>
+          <w:lang w:val="en-US"/>
+        </w:rPr>
+      </w:pPr>
+      <w:r>
+        <w:rPr/>
+      </w:r>
+    </w:p>
+    <w:p>
+      <w:pPr>
+        <w:pStyle w:val="Normal"/>
+        <w:jc w:val="center"/>
+        <w:rPr>
+          <w:lang w:val="en-US"/>
+        </w:rPr>
+      </w:pPr>
+      <w:r>
+        <w:rPr/>
+      </w:r>
+    </w:p>
+    <w:p>
+      <w:pPr>
+        <w:pStyle w:val="Normal"/>
+        <w:jc w:val="center"/>
+        <w:rPr>
+          <w:lang w:val="en-US"/>
+        </w:rPr>
+      </w:pPr>
+      <w:r>
+        <w:rPr/>
+      </w:r>
+    </w:p>
+    <w:p>
+      <w:pPr>
+        <w:pStyle w:val="Normal"/>
+        <w:jc w:val="center"/>
+        <w:rPr>
+          <w:lang w:val="en-US"/>
+        </w:rPr>
+      </w:pPr>
+      <w:r>
+        <w:rPr/>
+      </w:r>
+    </w:p>
+    <w:p>
+      <w:pPr>
+        <w:pStyle w:val="Normal"/>
+        <w:jc w:val="center"/>
+        <w:rPr>
+          <w:lang w:val="en-US"/>
+        </w:rPr>
+      </w:pPr>
+      <w:r>
+        <w:rPr/>
+      </w:r>
+    </w:p>
+    <w:p>
+      <w:pPr>
+        <w:pStyle w:val="Normal"/>
+        <w:jc w:val="center"/>
+        <w:rPr>
+          <w:lang w:val="en-US"/>
+        </w:rPr>
+      </w:pPr>
+      <w:r>
+        <w:rPr/>
+      </w:r>
+    </w:p>
+    <w:p>
+      <w:pPr>
+        <w:pStyle w:val="Normal"/>
+        <w:jc w:val="center"/>
+        <w:rPr>
+          <w:lang w:val="en-US"/>
+        </w:rPr>
+      </w:pPr>
+      <w:r>
+        <w:rPr/>
+      </w:r>
+    </w:p>
+    <w:p>
+      <w:pPr>
+        <w:pStyle w:val="Normal"/>
+        <w:jc w:val="center"/>
+        <w:rPr>
+          <w:lang w:val="en-US"/>
+        </w:rPr>
+      </w:pPr>
+      <w:r>
+        <w:rPr>
+          <w:lang w:val="en-US"/>
+        </w:rPr>
+        <w:t xml:space="preserve">Revision Arc I – Act </w:t>
+      </w:r>
+      <w:r>
+        <w:rPr>
+          <w:lang w:val="en-US"/>
+        </w:rPr>
+        <w:t>3</w:t>
+      </w:r>
+    </w:p>
+    <w:p>
+      <w:pPr>
+        <w:pStyle w:val="Normal"/>
+        <w:jc w:val="center"/>
+        <w:rPr>
+          <w:lang w:val="en-US"/>
+        </w:rPr>
+      </w:pPr>
+      <w:r>
+        <w:rPr>
+          <w:lang w:val="en-US"/>
+        </w:rPr>
+      </w:r>
+    </w:p>
+    <w:p>
+      <w:pPr>
+        <w:pStyle w:val="Normal"/>
+        <w:jc w:val="center"/>
+        <w:rPr>
+          <w:lang w:val="en-US"/>
+        </w:rPr>
+      </w:pPr>
+      <w:r>
+        <w:rPr>
+          <w:lang w:val="en-US"/>
+        </w:rPr>
+        <w:t>Life and Video Games are Full of Bugs</w:t>
+      </w:r>
+    </w:p>
+    <w:p>
+      <w:pPr>
+        <w:pStyle w:val="Normal"/>
+        <w:jc w:val="center"/>
+        <w:rPr>
+          <w:lang w:val="en-US"/>
+        </w:rPr>
+      </w:pPr>
+      <w:r>
+        <w:rPr>
+          <w:lang w:val="en-US"/>
+        </w:rPr>
+      </w:r>
+    </w:p>
+    <w:p>
+      <w:pPr>
+        <w:pStyle w:val="Normal"/>
+        <w:jc w:val="center"/>
+        <w:rPr>
+          <w:lang w:val="en-US"/>
+        </w:rPr>
+      </w:pPr>
+      <w:r>
+        <w:rPr>
+          <w:lang w:val="en-US"/>
+        </w:rPr>
+        <w:t>*Highlights/displays scene in metropolis (train bullet)*</w:t>
+      </w:r>
+    </w:p>
+    <w:p>
+      <w:pPr>
+        <w:pStyle w:val="Normal"/>
+        <w:jc w:val="center"/>
+        <w:rPr>
+          <w:lang w:val="en-US"/>
+        </w:rPr>
+      </w:pPr>
+      <w:r>
+        <w:rPr>
+          <w:lang w:val="en-US"/>
+        </w:rPr>
+        <w:t>Gintoki: This Visual Novel is still being played?</w:t>
+      </w:r>
+    </w:p>
+    <w:p>
+      <w:pPr>
+        <w:pStyle w:val="Normal"/>
+        <w:jc w:val="center"/>
+        <w:rPr>
+          <w:lang w:val="en-US"/>
+        </w:rPr>
+      </w:pPr>
+      <w:r>
+        <w:rPr>
+          <w:lang w:val="en-US"/>
+        </w:rPr>
+        <w:t>Gintoki: Hey, *insert player name*. Stop it already and try a new game.</w:t>
+      </w:r>
+    </w:p>
+    <w:p>
+      <w:pPr>
+        <w:pStyle w:val="Normal"/>
+        <w:jc w:val="center"/>
+        <w:rPr>
+          <w:lang w:val="en-US"/>
+        </w:rPr>
+      </w:pPr>
+      <w:r>
+        <w:rPr>
+          <w:lang w:val="en-US"/>
+        </w:rPr>
+        <w:t>Gintoki: What is with this Visual Novel anyway?!</w:t>
+      </w:r>
+    </w:p>
+    <w:p>
+      <w:pPr>
+        <w:pStyle w:val="Normal"/>
+        <w:jc w:val="center"/>
+        <w:rPr>
+          <w:lang w:val="en-US"/>
+        </w:rPr>
+      </w:pPr>
+      <w:r>
+        <w:rPr>
+          <w:lang w:val="en-US"/>
+        </w:rPr>
+        <w:t>Gintoki: It is so unpopular.</w:t>
+      </w:r>
+    </w:p>
+    <w:p>
+      <w:pPr>
+        <w:pStyle w:val="Normal"/>
+        <w:jc w:val="center"/>
+        <w:rPr>
+          <w:lang w:val="en-US"/>
+        </w:rPr>
+      </w:pPr>
+      <w:r>
+        <w:rPr>
+          <w:lang w:val="en-US"/>
+        </w:rPr>
+        <w:t>Gintoki: The script is really rough and cliche, and there is simply too much dialogue, idiot.</w:t>
+      </w:r>
+    </w:p>
+    <w:p>
+      <w:pPr>
+        <w:pStyle w:val="Normal"/>
+        <w:jc w:val="center"/>
+        <w:rPr>
+          <w:lang w:val="en-US"/>
+        </w:rPr>
+      </w:pPr>
+      <w:r>
+        <w:rPr>
+          <w:lang w:val="en-US"/>
+        </w:rPr>
+        <w:t>Gintoki: They say, “Use your imagination if you read a novel”.</w:t>
+      </w:r>
+    </w:p>
+    <w:p>
+      <w:pPr>
+        <w:pStyle w:val="Normal"/>
+        <w:jc w:val="center"/>
+        <w:rPr>
+          <w:lang w:val="en-US"/>
+        </w:rPr>
+      </w:pPr>
+      <w:r>
+        <w:rPr>
+          <w:lang w:val="en-US"/>
+        </w:rPr>
+        <w:t>Gintoki: That is wrong. “We are forced to read a novel the way the author wants us”.</w:t>
+      </w:r>
+    </w:p>
+    <w:p>
+      <w:pPr>
+        <w:pStyle w:val="Normal"/>
+        <w:jc w:val="center"/>
+        <w:rPr>
+          <w:lang w:val="en-US"/>
+        </w:rPr>
+      </w:pPr>
+      <w:r>
+        <w:rPr>
+          <w:lang w:val="en-US"/>
+        </w:rPr>
+        <w:t>Gintoki: I guess it is about time for the author find new inspiration/aspiration and let go of his unhealthy obsession with Gintama.</w:t>
+      </w:r>
+    </w:p>
+    <w:p>
+      <w:pPr>
+        <w:pStyle w:val="Normal"/>
+        <w:jc w:val="center"/>
+        <w:rPr>
+          <w:lang w:val="en-US"/>
+        </w:rPr>
+      </w:pPr>
+      <w:r>
+        <w:rPr>
+          <w:lang w:val="en-US"/>
+        </w:rPr>
+        <w:t>Gintoki: Although, we all know he cannot stop watching Gintama (for that is his live-long enjoyingment).</w:t>
+      </w:r>
+    </w:p>
+    <w:p>
+      <w:pPr>
+        <w:pStyle w:val="Normal"/>
+        <w:jc w:val="center"/>
+        <w:rPr>
+          <w:lang w:val="en-US"/>
+        </w:rPr>
+      </w:pPr>
+      <w:r>
+        <w:rPr>
+          <w:lang w:val="en-US"/>
+        </w:rPr>
+        <w:t>???: I would like to hear more.</w:t>
+      </w:r>
+    </w:p>
+    <w:p>
+      <w:pPr>
+        <w:pStyle w:val="Normal"/>
+        <w:jc w:val="center"/>
+        <w:rPr>
+          <w:lang w:val="en-US"/>
+        </w:rPr>
+      </w:pPr>
+      <w:r>
+        <w:rPr>
+          <w:lang w:val="en-US"/>
+        </w:rPr>
+        <w:t>???: What is the problem with this Visual Novel?</w:t>
+      </w:r>
+    </w:p>
+    <w:p>
+      <w:pPr>
+        <w:pStyle w:val="Normal"/>
+        <w:jc w:val="center"/>
+        <w:rPr>
+          <w:lang w:val="en-US"/>
+        </w:rPr>
+      </w:pPr>
+      <w:r>
+        <w:rPr>
+          <w:lang w:val="en-US"/>
+        </w:rPr>
+        <w:t>???: I think it is fairly good. I like it.</w:t>
+      </w:r>
+    </w:p>
+    <w:p>
+      <w:pPr>
+        <w:pStyle w:val="Normal"/>
+        <w:jc w:val="center"/>
+        <w:rPr>
+          <w:lang w:val="en-US"/>
+        </w:rPr>
+      </w:pPr>
+      <w:r>
+        <w:rPr>
+          <w:lang w:val="en-US"/>
+        </w:rPr>
+        <w:t xml:space="preserve">Gintoki: What is with you </w:t>
+      </w:r>
+      <w:r>
+        <w:rPr>
+          <w:lang w:val="en-US"/>
+        </w:rPr>
+        <w:t>####</w:t>
+      </w:r>
+      <w:r>
+        <w:rPr>
+          <w:lang w:val="en-US"/>
+        </w:rPr>
+        <w:t>, are you a fan of this Visual Novel?</w:t>
+      </w:r>
+    </w:p>
+    <w:p>
+      <w:pPr>
+        <w:pStyle w:val="Normal"/>
+        <w:jc w:val="center"/>
+        <w:rPr>
+          <w:lang w:val="en-US"/>
+        </w:rPr>
+      </w:pPr>
+      <w:r>
+        <w:rPr>
+          <w:lang w:val="en-US"/>
+        </w:rPr>
+        <w:t>Gintoki: You should not read this kind of novel. It will give you brainrot.</w:t>
+      </w:r>
+    </w:p>
+    <w:p>
+      <w:pPr>
+        <w:pStyle w:val="Normal"/>
+        <w:jc w:val="center"/>
+        <w:rPr>
+          <w:lang w:val="en-US"/>
+        </w:rPr>
+      </w:pPr>
+      <w:r>
+        <w:rPr>
+          <w:lang w:val="en-US"/>
+        </w:rPr>
+        <w:t>???: I am not ####, I am the author of this novel.</w:t>
+      </w:r>
+    </w:p>
+    <w:p>
+      <w:pPr>
+        <w:pStyle w:val="Normal"/>
+        <w:jc w:val="center"/>
+        <w:rPr>
+          <w:lang w:val="en-US"/>
+        </w:rPr>
+      </w:pPr>
+      <w:r>
+        <w:rPr>
+          <w:lang w:val="en-US"/>
+        </w:rPr>
+        <w:t>Author: I am asking you what the problem is with this novel.</w:t>
+      </w:r>
+    </w:p>
+    <w:p>
+      <w:pPr>
+        <w:pStyle w:val="Normal"/>
+        <w:jc w:val="center"/>
+        <w:rPr>
+          <w:lang w:val="en-US"/>
+        </w:rPr>
+      </w:pPr>
+      <w:r>
+        <w:rPr>
+          <w:lang w:val="en-US"/>
+        </w:rPr>
+        <w:t>Gintoki: It is the author’s fault.</w:t>
+      </w:r>
+    </w:p>
+    <w:p>
+      <w:pPr>
+        <w:pStyle w:val="Normal"/>
+        <w:jc w:val="center"/>
+        <w:rPr>
+          <w:lang w:val="en-US"/>
+        </w:rPr>
+      </w:pPr>
+      <w:r>
+        <w:rPr>
+          <w:lang w:val="en-US"/>
+        </w:rPr>
+        <w:t>Gintoki: It is the fault of the author, who left the novel unattended (since 2018) until now.</w:t>
+      </w:r>
+    </w:p>
+    <w:p>
+      <w:pPr>
+        <w:pStyle w:val="Normal"/>
+        <w:jc w:val="center"/>
+        <w:rPr>
+          <w:lang w:val="en-US"/>
+        </w:rPr>
+      </w:pPr>
+      <w:r>
+        <w:rPr>
+          <w:lang w:val="en-US"/>
+        </w:rPr>
+        <w:t>Author: That is how an amateur thinks.</w:t>
+      </w:r>
+    </w:p>
+    <w:p>
+      <w:pPr>
+        <w:pStyle w:val="Normal"/>
+        <w:jc w:val="center"/>
+        <w:rPr>
+          <w:lang w:val="en-US"/>
+        </w:rPr>
+      </w:pPr>
+      <w:r>
+        <w:rPr>
+          <w:lang w:val="en-US"/>
+        </w:rPr>
+        <w:t>Author: All masterpieces takes time and polish.</w:t>
+      </w:r>
+    </w:p>
+    <w:p>
+      <w:pPr>
+        <w:pStyle w:val="Normal"/>
+        <w:jc w:val="center"/>
+        <w:rPr>
+          <w:lang w:val="en-US"/>
+        </w:rPr>
+      </w:pPr>
+      <w:r>
+        <w:rPr>
+          <w:lang w:val="en-US"/>
+        </w:rPr>
+        <w:t>Author: Once the novel is finished, it is up to the author to survive by vastly improving.</w:t>
+      </w:r>
+    </w:p>
+    <w:p>
+      <w:pPr>
+        <w:pStyle w:val="Normal"/>
+        <w:jc w:val="center"/>
+        <w:rPr>
+          <w:lang w:val="en-US"/>
+        </w:rPr>
+      </w:pPr>
+      <w:r>
+        <w:rPr>
+          <w:lang w:val="en-US"/>
+        </w:rPr>
+        <w:t>Gintoki: Even if he survives, he should at least be able to stop this Visual Novel from going in the wrong direction.</w:t>
+      </w:r>
+    </w:p>
+    <w:p>
+      <w:pPr>
+        <w:pStyle w:val="Normal"/>
+        <w:jc w:val="center"/>
+        <w:rPr>
+          <w:lang w:val="en-US"/>
+        </w:rPr>
+      </w:pPr>
+      <w:r>
+        <w:rPr>
+          <w:lang w:val="en-US"/>
+        </w:rPr>
+        <w:t>Gintoki: I understand that this Visual Novel needs to have a lot of energy.</w:t>
+      </w:r>
+    </w:p>
+    <w:p>
+      <w:pPr>
+        <w:pStyle w:val="Normal"/>
+        <w:jc w:val="center"/>
+        <w:rPr>
+          <w:lang w:val="en-US"/>
+        </w:rPr>
+      </w:pPr>
+      <w:r>
+        <w:rPr>
+          <w:lang w:val="en-US"/>
+        </w:rPr>
+        <w:t>Gintoki: But when the author goes too far, it is his responsibility to correct himself in the right direction.</w:t>
+      </w:r>
+    </w:p>
+    <w:p>
+      <w:pPr>
+        <w:pStyle w:val="Normal"/>
+        <w:jc w:val="center"/>
+        <w:rPr>
+          <w:lang w:val="en-US"/>
+        </w:rPr>
+      </w:pPr>
+      <w:r>
+        <w:rPr>
+          <w:lang w:val="en-US"/>
+        </w:rPr>
+        <w:t>Gintoki: Obviously, I should be the author.</w:t>
+      </w:r>
+    </w:p>
+    <w:p>
+      <w:pPr>
+        <w:pStyle w:val="Normal"/>
+        <w:jc w:val="center"/>
+        <w:rPr>
+          <w:lang w:val="en-US"/>
+        </w:rPr>
+      </w:pPr>
+      <w:r>
+        <w:rPr>
+          <w:lang w:val="en-US"/>
+        </w:rPr>
+        <w:t>Gintoki: You do not know what you are doing.</w:t>
+      </w:r>
+    </w:p>
+    <w:p>
+      <w:pPr>
+        <w:pStyle w:val="Normal"/>
+        <w:jc w:val="center"/>
+        <w:rPr>
+          <w:lang w:val="en-US"/>
+        </w:rPr>
+      </w:pPr>
+      <w:r>
+        <w:rPr>
+          <w:lang w:val="en-US"/>
+        </w:rPr>
+        <w:t>Gintoki: I bet the authors of popular high-profile visual novels are all highly educated guys who have studied a lot of things, but do not understand the hearts of their supposed audience.</w:t>
+      </w:r>
+    </w:p>
+    <w:p>
+      <w:pPr>
+        <w:pStyle w:val="Normal"/>
+        <w:jc w:val="center"/>
+        <w:rPr>
+          <w:lang w:val="en-US"/>
+        </w:rPr>
+      </w:pPr>
+      <w:r>
+        <w:rPr>
+          <w:lang w:val="en-US"/>
+        </w:rPr>
+        <w:t>Gintoki: Hah, it would be better if this Visual Novel was not created in the first place.</w:t>
+      </w:r>
+    </w:p>
+    <w:p>
+      <w:pPr>
+        <w:pStyle w:val="Normal"/>
+        <w:jc w:val="center"/>
+        <w:rPr>
+          <w:lang w:val="en-US"/>
+        </w:rPr>
+      </w:pPr>
+      <w:r>
+        <w:rPr>
+          <w:lang w:val="en-US"/>
+        </w:rPr>
+        <w:t>Author: Then you do the development!! Do it if you can!!</w:t>
+      </w:r>
+    </w:p>
+    <w:p>
+      <w:pPr>
+        <w:pStyle w:val="Normal"/>
+        <w:jc w:val="center"/>
+        <w:rPr>
+          <w:lang w:val="en-US"/>
+        </w:rPr>
+      </w:pPr>
+      <w:r>
+        <w:rPr>
+          <w:lang w:val="en-US"/>
+        </w:rPr>
+        <w:t>Author: In fact, I would rather work on a mod for Doki Doki Literature Club or a fan-fiction of the Touhou Project!</w:t>
+      </w:r>
+    </w:p>
+    <w:p>
+      <w:pPr>
+        <w:pStyle w:val="Normal"/>
+        <w:jc w:val="center"/>
+        <w:rPr>
+          <w:lang w:val="en-US"/>
+        </w:rPr>
+      </w:pPr>
+      <w:r>
+        <w:rPr>
+          <w:lang w:val="en-US"/>
+        </w:rPr>
+        <w:t>Author: Something that is stylish and cute!</w:t>
+      </w:r>
+    </w:p>
+    <w:p>
+      <w:pPr>
+        <w:pStyle w:val="Normal"/>
+        <w:jc w:val="center"/>
+        <w:rPr>
+          <w:lang w:val="en-US"/>
+        </w:rPr>
+      </w:pPr>
+      <w:r>
+        <w:rPr>
+          <w:lang w:val="en-US"/>
+        </w:rPr>
+        <w:t>Author: But...but!</w:t>
+      </w:r>
+    </w:p>
+    <w:p>
+      <w:pPr>
+        <w:pStyle w:val="Normal"/>
+        <w:jc w:val="center"/>
+        <w:rPr>
+          <w:lang w:val="en-US"/>
+        </w:rPr>
+      </w:pPr>
+      <w:r>
+        <w:rPr>
+          <w:lang w:val="en-US"/>
+        </w:rPr>
+        <w:t>Author: I have to finish this Visual Novel based on Gintama for the sake of doing a proper job as a novelist.</w:t>
+      </w:r>
+    </w:p>
+    <w:p>
+      <w:pPr>
+        <w:pStyle w:val="Normal"/>
+        <w:jc w:val="center"/>
+        <w:rPr>
+          <w:lang w:val="en-US"/>
+        </w:rPr>
+      </w:pPr>
+      <w:r>
+        <w:rPr>
+          <w:lang w:val="en-US"/>
+        </w:rPr>
+        <w:t>Author: As is my pride and call.</w:t>
+      </w:r>
+    </w:p>
+    <w:p>
+      <w:pPr>
+        <w:pStyle w:val="Normal"/>
+        <w:jc w:val="center"/>
+        <w:rPr>
+          <w:lang w:val="en-US"/>
+        </w:rPr>
+      </w:pPr>
+      <w:r>
+        <w:rPr>
+          <w:lang w:val="en-US"/>
+        </w:rPr>
+        <w:t>Author: Why do I make this Visual Novel to begin with?!</w:t>
+      </w:r>
+    </w:p>
+    <w:p>
+      <w:pPr>
+        <w:pStyle w:val="Normal"/>
+        <w:jc w:val="center"/>
+        <w:rPr>
+          <w:lang w:val="en-US"/>
+        </w:rPr>
+      </w:pPr>
+      <w:r>
+        <w:rPr>
+          <w:lang w:val="en-US"/>
+        </w:rPr>
+        <w:t>Gintoki: Hey, hey, calm down.</w:t>
+      </w:r>
+    </w:p>
+    <w:p>
+      <w:pPr>
+        <w:pStyle w:val="Normal"/>
+        <w:jc w:val="center"/>
+        <w:rPr>
+          <w:lang w:val="en-US"/>
+        </w:rPr>
+      </w:pPr>
+      <w:r>
+        <w:rPr>
+          <w:lang w:val="en-US"/>
+        </w:rPr>
+        <w:t>Gintoki: Oh, I see...so you want to finish this Visual Novel by making it more stylish and cute?</w:t>
+      </w:r>
+    </w:p>
+    <w:p>
+      <w:pPr>
+        <w:pStyle w:val="Normal"/>
+        <w:jc w:val="center"/>
+        <w:rPr>
+          <w:lang w:val="en-US"/>
+        </w:rPr>
+      </w:pPr>
+      <w:r>
+        <w:rPr>
+          <w:lang w:val="en-US"/>
+        </w:rPr>
+        <w:t>Gintoki: Well, um, you know...I like High School DxD.</w:t>
+      </w:r>
+    </w:p>
+    <w:p>
+      <w:pPr>
+        <w:pStyle w:val="Normal"/>
+        <w:jc w:val="center"/>
+        <w:rPr>
+          <w:lang w:val="en-US"/>
+        </w:rPr>
+      </w:pPr>
+      <w:r>
+        <w:rPr>
+          <w:lang w:val="en-US"/>
+        </w:rPr>
+        <w:t>Author: That is an erotic anime! That is even more depraved than this novel!</w:t>
+      </w:r>
+    </w:p>
+    <w:p>
+      <w:pPr>
+        <w:pStyle w:val="Normal"/>
+        <w:jc w:val="center"/>
+        <w:rPr>
+          <w:lang w:val="en-US"/>
+        </w:rPr>
+      </w:pPr>
+      <w:r>
+        <w:rPr>
+          <w:lang w:val="en-US"/>
+        </w:rPr>
+        <w:t>Author: I would rather make more silly puns and stupid punch-lines/one-liners than introduce some erotic elements into this novel.</w:t>
+      </w:r>
+    </w:p>
+    <w:p>
+      <w:pPr>
+        <w:pStyle w:val="Normal"/>
+        <w:jc w:val="center"/>
+        <w:rPr>
+          <w:lang w:val="en-US"/>
+        </w:rPr>
+      </w:pPr>
+      <w:r>
+        <w:rPr>
+          <w:lang w:val="en-US"/>
+        </w:rPr>
+        <w:t>Gintoki: D-Do not worry! It will work out!! People these days want more fan-service, so you can attract a broader audience by doing so.</w:t>
+      </w:r>
+    </w:p>
+    <w:p>
+      <w:pPr>
+        <w:pStyle w:val="Normal"/>
+        <w:jc w:val="center"/>
+        <w:rPr>
+          <w:lang w:val="en-US"/>
+        </w:rPr>
+      </w:pPr>
+      <w:r>
+        <w:rPr>
+          <w:lang w:val="en-US"/>
+        </w:rPr>
+        <w:t>Author: That is just a cheap trick to make a novel more appealing than its actually story.</w:t>
+      </w:r>
+    </w:p>
+    <w:p>
+      <w:pPr>
+        <w:pStyle w:val="Normal"/>
+        <w:jc w:val="center"/>
+        <w:rPr>
+          <w:lang w:val="en-US"/>
+        </w:rPr>
+      </w:pPr>
+      <w:r>
+        <w:rPr>
+          <w:lang w:val="en-US"/>
+        </w:rPr>
+        <w:t>Author: Then it will not be a proper visual novel if it does not have a deep and thought-provoking story.</w:t>
+      </w:r>
+    </w:p>
+    <w:p>
+      <w:pPr>
+        <w:pStyle w:val="Normal"/>
+        <w:jc w:val="center"/>
+        <w:rPr>
+          <w:lang w:val="en-US"/>
+        </w:rPr>
+      </w:pPr>
+      <w:r>
+        <w:rPr>
+          <w:lang w:val="en-US"/>
+        </w:rPr>
+        <w:t>Author: ...I am inadequate for making a proper visual novel.</w:t>
+      </w:r>
+    </w:p>
+    <w:p>
+      <w:pPr>
+        <w:pStyle w:val="Normal"/>
+        <w:jc w:val="center"/>
+        <w:rPr>
+          <w:lang w:val="en-US"/>
+        </w:rPr>
+      </w:pPr>
+      <w:r>
+        <w:rPr>
+          <w:lang w:val="en-US"/>
+        </w:rPr>
+        <w:t>Author: I know it…I have known it.</w:t>
+      </w:r>
+    </w:p>
+    <w:p>
+      <w:pPr>
+        <w:pStyle w:val="Normal"/>
+        <w:jc w:val="center"/>
+        <w:rPr>
+          <w:lang w:val="en-US"/>
+        </w:rPr>
+      </w:pPr>
+      <w:r>
+        <w:rPr>
+          <w:lang w:val="en-US"/>
+        </w:rPr>
+        <w:t>Author: It was all so I could boast how creative I can be when doing this.</w:t>
+      </w:r>
+    </w:p>
+    <w:p>
+      <w:pPr>
+        <w:pStyle w:val="Normal"/>
+        <w:jc w:val="center"/>
+        <w:rPr>
+          <w:lang w:val="en-US"/>
+        </w:rPr>
+      </w:pPr>
+      <w:r>
+        <w:rPr>
+          <w:lang w:val="en-US"/>
+        </w:rPr>
+        <w:t>Author: I never thought I can make good novels.</w:t>
+      </w:r>
+    </w:p>
+    <w:p>
+      <w:pPr>
+        <w:pStyle w:val="Normal"/>
+        <w:jc w:val="center"/>
+        <w:rPr>
+          <w:lang w:val="en-US"/>
+        </w:rPr>
+      </w:pPr>
+      <w:r>
+        <w:rPr>
+          <w:lang w:val="en-US"/>
+        </w:rPr>
+        <w:t>Author: There is no way someone like me could develop and produce a novel that people enjoy.</w:t>
+      </w:r>
+    </w:p>
+    <w:p>
+      <w:pPr>
+        <w:pStyle w:val="Normal"/>
+        <w:jc w:val="center"/>
+        <w:rPr>
+          <w:lang w:val="en-US"/>
+        </w:rPr>
+      </w:pPr>
+      <w:r>
+        <w:rPr>
+          <w:lang w:val="en-US"/>
+        </w:rPr>
+        <w:t>Author: It makes sense that this novel does not appeal. That is right.</w:t>
+      </w:r>
+    </w:p>
+    <w:p>
+      <w:pPr>
+        <w:pStyle w:val="Normal"/>
+        <w:jc w:val="center"/>
+        <w:rPr>
+          <w:lang w:val="en-US"/>
+        </w:rPr>
+      </w:pPr>
+      <w:r>
+        <w:rPr>
+          <w:lang w:val="en-US"/>
+        </w:rPr>
+        <w:t>Gintoki: Let me do it.</w:t>
+      </w:r>
+    </w:p>
+    <w:p>
+      <w:pPr>
+        <w:pStyle w:val="Normal"/>
+        <w:jc w:val="center"/>
+        <w:rPr>
+          <w:lang w:val="en-US"/>
+        </w:rPr>
+      </w:pPr>
+      <w:r>
+        <w:rPr>
+          <w:lang w:val="en-US"/>
+        </w:rPr>
+        <w:t>Gintoki: If the proper visual novel does not exist, then we just have to create it.</w:t>
+      </w:r>
+    </w:p>
+    <w:p>
+      <w:pPr>
+        <w:pStyle w:val="Normal"/>
+        <w:jc w:val="center"/>
+        <w:rPr>
+          <w:lang w:val="en-US"/>
+        </w:rPr>
+      </w:pPr>
+      <w:r>
+        <w:rPr>
+          <w:lang w:val="en-US"/>
+        </w:rPr>
+        <w:t>Gintoki: It is your job to create something that you think is fun, right?</w:t>
+      </w:r>
+    </w:p>
+    <w:p>
+      <w:pPr>
+        <w:pStyle w:val="Normal"/>
+        <w:jc w:val="center"/>
+        <w:rPr>
+          <w:lang w:val="en-US"/>
+        </w:rPr>
+      </w:pPr>
+      <w:r>
+        <w:rPr>
+          <w:lang w:val="en-US"/>
+        </w:rPr>
+        <w:t>Gintoki: I have been reading novels for twenty years.</w:t>
+      </w:r>
+    </w:p>
+    <w:p>
+      <w:pPr>
+        <w:pStyle w:val="Normal"/>
+        <w:jc w:val="center"/>
+        <w:rPr>
+          <w:lang w:val="en-US"/>
+        </w:rPr>
+      </w:pPr>
+      <w:r>
+        <w:rPr>
+          <w:lang w:val="en-US"/>
+        </w:rPr>
+        <w:t>Gintoki: So I will teach you about what makes a novel good.</w:t>
+      </w:r>
+    </w:p>
+    <w:p>
+      <w:pPr>
+        <w:pStyle w:val="Normal"/>
+        <w:jc w:val="center"/>
+        <w:rPr>
+          <w:lang w:val="en-US"/>
+        </w:rPr>
+      </w:pPr>
+      <w:r>
+        <w:rPr>
+          <w:lang w:val="en-US"/>
+        </w:rPr>
+      </w:r>
+    </w:p>
+    <w:p>
+      <w:pPr>
+        <w:pStyle w:val="Normal"/>
+        <w:jc w:val="center"/>
+        <w:rPr>
+          <w:lang w:val="en-US"/>
+        </w:rPr>
+      </w:pPr>
+      <w:r>
+        <w:rPr>
+          <w:lang w:val="en-US"/>
+        </w:rPr>
+        <w:t>- inner-dialogue/monologue starts -</w:t>
+      </w:r>
+    </w:p>
+    <w:p>
+      <w:pPr>
+        <w:pStyle w:val="Normal"/>
+        <w:jc w:val="center"/>
+        <w:rPr>
+          <w:lang w:val="en-US"/>
+        </w:rPr>
+      </w:pPr>
+      <w:r>
+        <w:rPr>
+          <w:lang w:val="en-US"/>
+        </w:rPr>
+        <w:t>[“Are you proud of this visual novel?]</w:t>
+      </w:r>
+    </w:p>
+    <w:p>
+      <w:pPr>
+        <w:pStyle w:val="Normal"/>
+        <w:jc w:val="center"/>
+        <w:rPr>
+          <w:lang w:val="en-US"/>
+        </w:rPr>
+      </w:pPr>
+      <w:r>
+        <w:rPr>
+          <w:lang w:val="en-US"/>
+        </w:rPr>
+        <w:t>Player choice: Yes/No</w:t>
+      </w:r>
+    </w:p>
+    <w:p>
+      <w:pPr>
+        <w:pStyle w:val="Normal"/>
+        <w:jc w:val="center"/>
+        <w:rPr>
+          <w:lang w:val="en-US"/>
+        </w:rPr>
+      </w:pPr>
+      <w:r>
+        <w:rPr>
+          <w:lang w:val="en-US"/>
+        </w:rPr>
+        <w:t>[“Are you enjoying this visual novel?]</w:t>
+      </w:r>
+    </w:p>
+    <w:p>
+      <w:pPr>
+        <w:pStyle w:val="Normal"/>
+        <w:jc w:val="center"/>
+        <w:rPr>
+          <w:lang w:val="en-US"/>
+        </w:rPr>
+      </w:pPr>
+      <w:r>
+        <w:rPr>
+          <w:lang w:val="en-US"/>
+        </w:rPr>
+        <w:t>Player choice: Yes/No</w:t>
+      </w:r>
+    </w:p>
+    <w:p>
+      <w:pPr>
+        <w:pStyle w:val="Normal"/>
+        <w:jc w:val="center"/>
+        <w:rPr>
+          <w:lang w:val="en-US"/>
+        </w:rPr>
+      </w:pPr>
+      <w:r>
+        <w:rPr>
+          <w:lang w:val="en-US"/>
+        </w:rPr>
+        <w:t>[“Do you like this visual novel?]</w:t>
+      </w:r>
+    </w:p>
+    <w:p>
+      <w:pPr>
+        <w:pStyle w:val="Normal"/>
+        <w:jc w:val="center"/>
+        <w:rPr>
+          <w:lang w:val="en-US"/>
+        </w:rPr>
+      </w:pPr>
+      <w:r>
+        <w:rPr>
+          <w:lang w:val="en-US"/>
+        </w:rPr>
+        <w:t>Player choice: Yes/No</w:t>
+      </w:r>
+    </w:p>
+    <w:p>
+      <w:pPr>
+        <w:pStyle w:val="Normal"/>
+        <w:jc w:val="center"/>
+        <w:rPr>
+          <w:lang w:val="en-US"/>
+        </w:rPr>
+      </w:pPr>
+      <w:r>
+        <w:rPr>
+          <w:lang w:val="en-US"/>
+        </w:rPr>
+      </w:r>
+    </w:p>
+    <w:p>
+      <w:pPr>
+        <w:pStyle w:val="Normal"/>
+        <w:jc w:val="center"/>
+        <w:rPr>
+          <w:lang w:val="en-US"/>
+        </w:rPr>
+      </w:pPr>
+      <w:r>
+        <w:rPr>
+          <w:lang w:val="en-US"/>
+        </w:rPr>
+        <w:t xml:space="preserve"> </w:t>
+      </w:r>
+    </w:p>
+    <w:p>
+      <w:pPr>
+        <w:pStyle w:val="Normal"/>
+        <w:jc w:val="center"/>
+        <w:rPr>
+          <w:lang w:val="en-US"/>
+        </w:rPr>
+      </w:pPr>
+      <w:r>
+        <w:rPr>
+          <w:lang w:val="en-US"/>
+        </w:rPr>
+      </w:r>
+    </w:p>
+    <w:p>
+      <w:pPr>
+        <w:pStyle w:val="Normal"/>
+        <w:jc w:val="center"/>
+        <w:rPr>
+          <w:lang w:val="en-US"/>
+        </w:rPr>
+      </w:pPr>
+      <w:r>
+        <w:rPr>
+          <w:lang w:val="en-US"/>
+        </w:rPr>
+      </w:r>
+    </w:p>
+    <w:p>
+      <w:pPr>
+        <w:pStyle w:val="Normal"/>
+        <w:jc w:val="center"/>
+        <w:rPr>
+          <w:lang w:val="en-US"/>
+        </w:rPr>
+      </w:pPr>
+      <w:r>
+        <w:rPr>
+          <w:lang w:val="en-US"/>
+        </w:rPr>
+      </w:r>
+    </w:p>
+    <w:p>
+      <w:pPr>
+        <w:pStyle w:val="Normal"/>
+        <w:jc w:val="center"/>
+        <w:rPr>
+          <w:lang w:val="en-US"/>
+        </w:rPr>
+      </w:pPr>
+      <w:r>
+        <w:rPr>
+          <w:lang w:val="en-US"/>
+        </w:rPr>
       </w:r>
     </w:p>
     <w:p>
@@ -4384,6 +6770,7 @@
     <w:qFormat/>
     <w:pPr>
       <w:widowControl/>
+      <w:suppressAutoHyphens w:val="true"/>
       <w:bidi w:val="0"/>
       <w:spacing w:lineRule="auto" w:line="259" w:before="0" w:after="160"/>
       <w:jc w:val="left"/>

</xml_diff>